<commit_message>
created schematics, and logic driagram
</commit_message>
<xml_diff>
--- a/doc/2.Document Annexe/PV/PV_18_08_2025_2510_RegulationChauffage_Mendes.docx
+++ b/doc/2.Document Annexe/PV/PV_18_08_2025_2510_RegulationChauffage_Mendes.docx
@@ -81,11 +81,9 @@
       <w:r>
         <w:t xml:space="preserve">2510 - </w:t>
       </w:r>
-      <w:proofErr w:type="spellStart"/>
-      <w:r>
-        <w:t>Regulation</w:t>
-      </w:r>
-      <w:proofErr w:type="spellEnd"/>
+      <w:r>
+        <w:t>Régulation</w:t>
+      </w:r>
       <w:r>
         <w:t xml:space="preserve"> Chauffage</w:t>
       </w:r>
@@ -246,6 +244,13 @@
         </w:rPr>
         <w:t xml:space="preserve"> de la consigne et cahier des charges</w:t>
       </w:r>
+      <w:r>
+        <w:rPr>
+          <w:rFonts w:ascii="Helvetica" w:hAnsi="Helvetica"/>
+          <w:sz w:val="22"/>
+        </w:rPr>
+        <w:t>.</w:t>
+      </w:r>
     </w:p>
     <w:p>
       <w:pPr>
@@ -277,6 +282,13 @@
         <w:t>M.Graf</w:t>
       </w:r>
       <w:proofErr w:type="spellEnd"/>
+      <w:r>
+        <w:rPr>
+          <w:rFonts w:ascii="Helvetica" w:hAnsi="Helvetica"/>
+          <w:sz w:val="22"/>
+        </w:rPr>
+        <w:t>.</w:t>
+      </w:r>
     </w:p>
     <w:p>
       <w:pPr>
@@ -311,7 +323,7 @@
           <w:rFonts w:ascii="Helvetica" w:hAnsi="Helvetica"/>
           <w:sz w:val="22"/>
         </w:rPr>
-        <w:t xml:space="preserve"> </w:t>
+        <w:t>.</w:t>
       </w:r>
     </w:p>
     <w:p>
@@ -524,28 +536,37 @@
           <w:rFonts w:ascii="Helvetica" w:hAnsi="Helvetica"/>
           <w:sz w:val="22"/>
         </w:rPr>
-        <w:t xml:space="preserve">Comment fonctionne l’API Oblo ? </w:t>
-      </w:r>
-    </w:p>
-    <w:p>
-      <w:pPr>
-        <w:pStyle w:val="Paragraphedeliste1"/>
-        <w:numPr>
-          <w:ilvl w:val="0"/>
-          <w:numId w:val="7"/>
-        </w:numPr>
-        <w:jc w:val="left"/>
-        <w:rPr>
-          <w:rFonts w:ascii="Helvetica" w:hAnsi="Helvetica"/>
-          <w:sz w:val="22"/>
-        </w:rPr>
-      </w:pPr>
-      <w:r>
-        <w:rPr>
-          <w:rFonts w:ascii="Helvetica" w:hAnsi="Helvetica"/>
-          <w:sz w:val="22"/>
-        </w:rPr>
-        <w:t>Questionnement sur le financement des composants entre l’entreprise et l’écoles</w:t>
+        <w:t xml:space="preserve">Questionnement </w:t>
+      </w:r>
+      <w:r>
+        <w:rPr>
+          <w:rFonts w:ascii="Helvetica" w:hAnsi="Helvetica"/>
+          <w:sz w:val="22"/>
+        </w:rPr>
+        <w:t xml:space="preserve">de </w:t>
+      </w:r>
+      <w:proofErr w:type="spellStart"/>
+      <w:r>
+        <w:rPr>
+          <w:rFonts w:ascii="Helvetica" w:hAnsi="Helvetica"/>
+          <w:sz w:val="22"/>
+        </w:rPr>
+        <w:t>M.Bovet</w:t>
+      </w:r>
+      <w:proofErr w:type="spellEnd"/>
+      <w:r>
+        <w:rPr>
+          <w:rFonts w:ascii="Helvetica" w:hAnsi="Helvetica"/>
+          <w:sz w:val="22"/>
+        </w:rPr>
+        <w:t xml:space="preserve"> </w:t>
+      </w:r>
+      <w:r>
+        <w:rPr>
+          <w:rFonts w:ascii="Helvetica" w:hAnsi="Helvetica"/>
+          <w:sz w:val="22"/>
+        </w:rPr>
+        <w:t>sur le financement des composants entre l’entreprise et l’écoles</w:t>
       </w:r>
     </w:p>
     <w:p>
@@ -800,7 +821,21 @@
           <w:rFonts w:ascii="Helvetica" w:hAnsi="Helvetica"/>
           <w:sz w:val="22"/>
         </w:rPr>
-        <w:t>Fin de la schématique vendredi 22.08.2025</w:t>
+        <w:t xml:space="preserve">Fin de la schématique </w:t>
+      </w:r>
+      <w:r>
+        <w:rPr>
+          <w:rFonts w:ascii="Helvetica" w:hAnsi="Helvetica"/>
+          <w:sz w:val="22"/>
+        </w:rPr>
+        <w:t xml:space="preserve">pour le </w:t>
+      </w:r>
+      <w:r>
+        <w:rPr>
+          <w:rFonts w:ascii="Helvetica" w:hAnsi="Helvetica"/>
+          <w:sz w:val="22"/>
+        </w:rPr>
+        <w:t>vendredi 22.08.2025</w:t>
       </w:r>
     </w:p>
     <w:p>
@@ -821,7 +856,21 @@
           <w:rFonts w:ascii="Helvetica" w:hAnsi="Helvetica"/>
           <w:sz w:val="22"/>
         </w:rPr>
-        <w:t>Revue de la schématique Lundi 22.08.2025</w:t>
+        <w:t xml:space="preserve">Revue de la schématique </w:t>
+      </w:r>
+      <w:r>
+        <w:rPr>
+          <w:rFonts w:ascii="Helvetica" w:hAnsi="Helvetica"/>
+          <w:sz w:val="22"/>
+        </w:rPr>
+        <w:t>le l</w:t>
+      </w:r>
+      <w:r>
+        <w:rPr>
+          <w:rFonts w:ascii="Helvetica" w:hAnsi="Helvetica"/>
+          <w:sz w:val="22"/>
+        </w:rPr>
+        <w:t>undi 22.08.2025</w:t>
       </w:r>
     </w:p>
     <w:p>
@@ -842,7 +891,21 @@
           <w:rFonts w:ascii="Helvetica" w:hAnsi="Helvetica"/>
           <w:sz w:val="22"/>
         </w:rPr>
-        <w:t>Finalisation du PCB vendredi 29.08.2025</w:t>
+        <w:t xml:space="preserve">Finalisation du PCB </w:t>
+      </w:r>
+      <w:r>
+        <w:rPr>
+          <w:rFonts w:ascii="Helvetica" w:hAnsi="Helvetica"/>
+          <w:sz w:val="22"/>
+        </w:rPr>
+        <w:t xml:space="preserve">le </w:t>
+      </w:r>
+      <w:r>
+        <w:rPr>
+          <w:rFonts w:ascii="Helvetica" w:hAnsi="Helvetica"/>
+          <w:sz w:val="22"/>
+        </w:rPr>
+        <w:t>vendredi 29.08.2025</w:t>
       </w:r>
     </w:p>
     <w:p>
@@ -893,7 +956,35 @@
           <w:rFonts w:ascii="Helvetica" w:hAnsi="Helvetica"/>
           <w:sz w:val="22"/>
         </w:rPr>
-        <w:t xml:space="preserve">22.08.2025, ???, ??? – Suivit projets. </w:t>
+        <w:t>22.08.2025, </w:t>
+      </w:r>
+      <w:r>
+        <w:rPr>
+          <w:rFonts w:ascii="Helvetica" w:hAnsi="Helvetica"/>
+          <w:sz w:val="22"/>
+        </w:rPr>
+        <w:t>16h30</w:t>
+      </w:r>
+      <w:r>
+        <w:rPr>
+          <w:rFonts w:ascii="Helvetica" w:hAnsi="Helvetica"/>
+          <w:sz w:val="22"/>
+        </w:rPr>
+        <w:t>, </w:t>
+      </w:r>
+      <w:r>
+        <w:rPr>
+          <w:rFonts w:ascii="Helvetica" w:hAnsi="Helvetica"/>
+          <w:sz w:val="22"/>
+        </w:rPr>
+        <w:t xml:space="preserve">Visioconférence </w:t>
+      </w:r>
+      <w:r>
+        <w:rPr>
+          <w:rFonts w:ascii="Helvetica" w:hAnsi="Helvetica"/>
+          <w:sz w:val="22"/>
+        </w:rPr>
+        <w:t xml:space="preserve">– Suivit projets. </w:t>
       </w:r>
     </w:p>
     <w:p>
@@ -1296,7 +1387,7 @@
         <w:rFonts w:ascii="Helvetica" w:hAnsi="Helvetica"/>
         <w:sz w:val="20"/>
       </w:rPr>
-      <w:t>Document1</w:t>
+      <w:t>PV_18_08_2025_2510_RegulationChauffage_Mendes.docx</w:t>
     </w:r>
     <w:r>
       <w:rPr>
@@ -1338,7 +1429,7 @@
         <w:rFonts w:ascii="Helvetica" w:hAnsi="Helvetica"/>
         <w:sz w:val="20"/>
       </w:rPr>
-      <w:t>18.08.2025</w:t>
+      <w:t>19.08.2025</w:t>
     </w:r>
     <w:r>
       <w:rPr>
@@ -1665,7 +1756,7 @@
         <w:rFonts w:ascii="Helvetica" w:hAnsi="Helvetica"/>
         <w:color w:val="595959" w:themeColor="text1" w:themeTint="A6"/>
       </w:rPr>
-      <w:t>Document1</w:t>
+      <w:t>PV_18_08_2025_2510_RegulationChauffage_Mendes.docx</w:t>
     </w:r>
     <w:r>
       <w:rPr>
@@ -4258,6 +4349,10 @@
 </file>
 
 <file path=customXml/item1.xml><?xml version="1.0" encoding="utf-8"?>
+<b:Sources xmlns:b="http://schemas.openxmlformats.org/officeDocument/2006/bibliography" xmlns="http://schemas.openxmlformats.org/officeDocument/2006/bibliography" SelectedStyle="\APA.XSL" StyleName="APA"/>
+</file>
+
+<file path=customXml/item2.xml><?xml version="1.0" encoding="utf-8"?>
 <p:properties xmlns:p="http://schemas.microsoft.com/office/2006/metadata/properties" xmlns:xsi="http://www.w3.org/2001/XMLSchema-instance" xmlns:pc="http://schemas.microsoft.com/office/infopath/2007/PartnerControls">
   <documentManagement>
     <TaxCatchAll xmlns="f7d9f5a6-831d-4621-8c77-cbcaf993e406" xsi:nil="true"/>
@@ -4268,20 +4363,7 @@
 </p:properties>
 </file>
 
-<file path=customXml/item2.xml><?xml version="1.0" encoding="utf-8"?>
-<b:Sources xmlns:b="http://schemas.openxmlformats.org/officeDocument/2006/bibliography" xmlns="http://schemas.openxmlformats.org/officeDocument/2006/bibliography" SelectedStyle="\APA.XSL" StyleName="APA"/>
-</file>
-
 <file path=customXml/item3.xml><?xml version="1.0" encoding="utf-8"?>
-<?mso-contentType ?>
-<FormTemplates xmlns="http://schemas.microsoft.com/sharepoint/v3/contenttype/forms">
-  <Display>DocumentLibraryForm</Display>
-  <Edit>DocumentLibraryForm</Edit>
-  <New>DocumentLibraryForm</New>
-</FormTemplates>
-</file>
-
-<file path=customXml/item4.xml><?xml version="1.0" encoding="utf-8"?>
 <ct:contentTypeSchema xmlns:ct="http://schemas.microsoft.com/office/2006/metadata/contentType" xmlns:ma="http://schemas.microsoft.com/office/2006/metadata/properties/metaAttributes" ct:_="" ma:_="" ma:contentTypeName="Document" ma:contentTypeID="0x010100B0BC76B2D102614AB68281AB1B3655C7" ma:contentTypeVersion="18" ma:contentTypeDescription="Crée un document." ma:contentTypeScope="" ma:versionID="a5ba1717af84e34c0a7143409c151512">
   <xsd:schema xmlns:xsd="http://www.w3.org/2001/XMLSchema" xmlns:xs="http://www.w3.org/2001/XMLSchema" xmlns:p="http://schemas.microsoft.com/office/2006/metadata/properties" xmlns:ns2="855f036e-00a9-480e-8309-7c710e134e0a" xmlns:ns3="f7d9f5a6-831d-4621-8c77-cbcaf993e406" targetNamespace="http://schemas.microsoft.com/office/2006/metadata/properties" ma:root="true" ma:fieldsID="952f49621ca0688a3265094fe61dcb0c" ns2:_="" ns3:_="">
     <xsd:import namespace="855f036e-00a9-480e-8309-7c710e134e0a"/>
@@ -4536,7 +4618,24 @@
 </ct:contentTypeSchema>
 </file>
 
+<file path=customXml/item4.xml><?xml version="1.0" encoding="utf-8"?>
+<?mso-contentType ?>
+<FormTemplates xmlns="http://schemas.microsoft.com/sharepoint/v3/contenttype/forms">
+  <Display>DocumentLibraryForm</Display>
+  <Edit>DocumentLibraryForm</Edit>
+  <New>DocumentLibraryForm</New>
+</FormTemplates>
+</file>
+
 <file path=customXml/itemProps1.xml><?xml version="1.0" encoding="utf-8"?>
+<ds:datastoreItem xmlns:ds="http://schemas.openxmlformats.org/officeDocument/2006/customXml" ds:itemID="{291CC5BD-35A6-41A9-B261-BC636867E62C}">
+  <ds:schemaRefs>
+    <ds:schemaRef ds:uri="http://schemas.openxmlformats.org/officeDocument/2006/bibliography"/>
+  </ds:schemaRefs>
+</ds:datastoreItem>
+</file>
+
+<file path=customXml/itemProps2.xml><?xml version="1.0" encoding="utf-8"?>
 <ds:datastoreItem xmlns:ds="http://schemas.openxmlformats.org/officeDocument/2006/customXml" ds:itemID="{F8681EE4-451D-4DD6-810D-0A09C9094768}">
   <ds:schemaRefs>
     <ds:schemaRef ds:uri="http://schemas.microsoft.com/office/2006/metadata/properties"/>
@@ -4547,23 +4646,7 @@
 </ds:datastoreItem>
 </file>
 
-<file path=customXml/itemProps2.xml><?xml version="1.0" encoding="utf-8"?>
-<ds:datastoreItem xmlns:ds="http://schemas.openxmlformats.org/officeDocument/2006/customXml" ds:itemID="{291CC5BD-35A6-41A9-B261-BC636867E62C}">
-  <ds:schemaRefs>
-    <ds:schemaRef ds:uri="http://schemas.openxmlformats.org/officeDocument/2006/bibliography"/>
-  </ds:schemaRefs>
-</ds:datastoreItem>
-</file>
-
 <file path=customXml/itemProps3.xml><?xml version="1.0" encoding="utf-8"?>
-<ds:datastoreItem xmlns:ds="http://schemas.openxmlformats.org/officeDocument/2006/customXml" ds:itemID="{631FEB60-E730-4A14-9F50-5235805E0623}">
-  <ds:schemaRefs>
-    <ds:schemaRef ds:uri="http://schemas.microsoft.com/sharepoint/v3/contenttype/forms"/>
-  </ds:schemaRefs>
-</ds:datastoreItem>
-</file>
-
-<file path=customXml/itemProps4.xml><?xml version="1.0" encoding="utf-8"?>
 <ds:datastoreItem xmlns:ds="http://schemas.openxmlformats.org/officeDocument/2006/customXml" ds:itemID="{95F33295-DF49-4D67-A3FF-035C0D3248EC}">
   <ds:schemaRefs>
     <ds:schemaRef ds:uri="http://schemas.microsoft.com/office/2006/metadata/contentType"/>
@@ -4580,4 +4663,12 @@
     <ds:schemaRef ds:uri="http://schemas.microsoft.com/internal/obd"/>
   </ds:schemaRefs>
 </ds:datastoreItem>
+</file>
+
+<file path=customXml/itemProps4.xml><?xml version="1.0" encoding="utf-8"?>
+<ds:datastoreItem xmlns:ds="http://schemas.openxmlformats.org/officeDocument/2006/customXml" ds:itemID="{631FEB60-E730-4A14-9F50-5235805E0623}">
+  <ds:schemaRefs>
+    <ds:schemaRef ds:uri="http://schemas.microsoft.com/sharepoint/v3/contenttype/forms"/>
+  </ds:schemaRefs>
+</ds:datastoreItem>
 </file>
</xml_diff>